<commit_message>
Fix README versions and Q1/Q2/Q8 limits; update Design Document
</commit_message>
<xml_diff>
--- a/docs/Database_Design_Document.docx
+++ b/docs/Database_Design_Document.docx
@@ -88,15 +88,7 @@
           <w:sz w:val="22"/>
           <w:szCs w:val="22"/>
         </w:rPr>
-        <w:t xml:space="preserve">Group No :</w:t>
-      </w:r>
-      <w:r>
-        <w:rPr>
-          <w:rFonts w:ascii="Times New Roman" w:cs="Times New Roman" w:eastAsia="Times New Roman" w:hAnsi="Times New Roman"/>
-          <w:sz w:val="22"/>
-          <w:szCs w:val="22"/>
-        </w:rPr>
-        <w:t xml:space="preserve"> A2</w:t>
+        <w:t xml:space="preserve">Group No : A2</w:t>
       </w:r>
     </w:p>
     <w:p>
@@ -500,15 +492,7 @@
           <w:sz w:val="22"/>
           <w:szCs w:val="22"/>
         </w:rPr>
-        <w:t xml:space="preserve">Project Title :</w:t>
-      </w:r>
-      <w:r>
-        <w:rPr>
-          <w:rFonts w:ascii="Times New Roman" w:cs="Times New Roman" w:eastAsia="Times New Roman" w:hAnsi="Times New Roman"/>
-          <w:sz w:val="22"/>
-          <w:szCs w:val="22"/>
-        </w:rPr>
-        <w:t xml:space="preserve"> Academic Research Metadata Repository: A Relational Database System</w:t>
+        <w:t xml:space="preserve">Project Title : Academic Research Metadata Repository: A Relational Database System</w:t>
       </w:r>
     </w:p>
     <w:p>
@@ -557,23 +541,7 @@
           <w:sz w:val="22"/>
           <w:szCs w:val="22"/>
         </w:rPr>
-        <w:t xml:space="preserve">Scholarly research is scattered across many publishers and journals, which makes it hard for students and researchers to locate relevant papers, trace how papers cite one another, or discover work across disciplines. The objective of this project is to centralise research </w:t>
-      </w:r>
-      <w:r>
-        <w:rPr>
-          <w:rFonts w:ascii="Times New Roman" w:cs="Times New Roman" w:eastAsia="Times New Roman" w:hAnsi="Times New Roman"/>
-          <w:sz w:val="22"/>
-          <w:szCs w:val="22"/>
-        </w:rPr>
-        <w:t xml:space="preserve">metadata</w:t>
-      </w:r>
-      <w:r>
-        <w:rPr>
-          <w:rFonts w:ascii="Times New Roman" w:cs="Times New Roman" w:eastAsia="Times New Roman" w:hAnsi="Times New Roman"/>
-          <w:sz w:val="22"/>
-          <w:szCs w:val="22"/>
-        </w:rPr>
-        <w:t xml:space="preserve"> (not the papers themselves) in a single, queryable relational database implemented in PostgreSQL. The database stores papers, their authors, the journals and publishers that carry them, the subjects they belong to, and the citations between papers. It supports two kinds of use: searching the repository, and analysing it through citation statistics.</w:t>
+        <w:t xml:space="preserve">Scholarly research is scattered across many publishers and journals, which makes it hard for students and researchers to locate relevant papers, trace how papers cite one another, or discover work across disciplines. The objective of this project is to centralise research metadata (not the papers themselves) in a single, queryable relational database implemented in PostgreSQL. The database stores papers, their authors, the journals and publishers that carry them, the subjects they belong to, and the citations between papers. It supports two kinds of use: searching the repository, and analysing it through citation statistics.</w:t>
       </w:r>
     </w:p>
     <w:p>
@@ -1854,23 +1822,7 @@
                 <w:sz w:val="19"/>
                 <w:szCs w:val="19"/>
               </w:rPr>
-              <w:t xml:space="preserve">An author writes zero or more papers. Every paper has at least one author. The relationship carries the attribute </w:t>
-            </w:r>
-            <w:r>
-              <w:rPr>
-                <w:rFonts w:ascii="Times New Roman" w:cs="Times New Roman" w:eastAsia="Times New Roman" w:hAnsi="Times New Roman"/>
-                <w:sz w:val="19"/>
-                <w:szCs w:val="19"/>
-              </w:rPr>
-              <w:t xml:space="preserve">author_order</w:t>
-            </w:r>
-            <w:r>
-              <w:rPr>
-                <w:rFonts w:ascii="Times New Roman" w:cs="Times New Roman" w:eastAsia="Times New Roman" w:hAnsi="Times New Roman"/>
-                <w:sz w:val="19"/>
-                <w:szCs w:val="19"/>
-              </w:rPr>
-              <w:t xml:space="preserve"> (the author's position on that paper).</w:t>
+              <w:t xml:space="preserve">An author writes zero or more papers. Every paper has at least one author. The relationship carries the attribute author_order (the author's position on that paper).</w:t>
             </w:r>
           </w:p>
         </w:tc>
@@ -3225,23 +3177,7 @@
                 <w:sz w:val="19"/>
                 <w:szCs w:val="19"/>
               </w:rPr>
-              <w:t xml:space="preserve"> on each table. Author names are deliberately </w:t>
-            </w:r>
-            <w:r>
-              <w:rPr>
-                <w:rFonts w:ascii="Times New Roman" w:cs="Times New Roman" w:eastAsia="Times New Roman" w:hAnsi="Times New Roman"/>
-                <w:sz w:val="19"/>
-                <w:szCs w:val="19"/>
-              </w:rPr>
-              <w:t xml:space="preserve">not</w:t>
-            </w:r>
-            <w:r>
-              <w:rPr>
-                <w:rFonts w:ascii="Times New Roman" w:cs="Times New Roman" w:eastAsia="Times New Roman" w:hAnsi="Times New Roman"/>
-                <w:sz w:val="19"/>
-                <w:szCs w:val="19"/>
-              </w:rPr>
-              <w:t xml:space="preserve"> unique.</w:t>
+              <w:t xml:space="preserve"> on each table. Author names are deliberately not unique.</w:t>
             </w:r>
           </w:p>
         </w:tc>
@@ -3757,39 +3693,7 @@
           <w:sz w:val="22"/>
           <w:szCs w:val="22"/>
         </w:rPr>
-        <w:t xml:space="preserve">The design is presented at two levels. Figure 3.1 is the </w:t>
-      </w:r>
-      <w:r>
-        <w:rPr>
-          <w:rFonts w:ascii="Times New Roman" w:cs="Times New Roman" w:eastAsia="Times New Roman" w:hAnsi="Times New Roman"/>
-          <w:sz w:val="22"/>
-          <w:szCs w:val="22"/>
-        </w:rPr>
-        <w:t xml:space="preserve">conceptual ER diagram</w:t>
-      </w:r>
-      <w:r>
-        <w:rPr>
-          <w:rFonts w:ascii="Times New Roman" w:cs="Times New Roman" w:eastAsia="Times New Roman" w:hAnsi="Times New Roman"/>
-          <w:sz w:val="22"/>
-          <w:szCs w:val="22"/>
-        </w:rPr>
-        <w:t xml:space="preserve">: five entities and five relationships, with cardinality and participation. Figure 3.2 is the </w:t>
-      </w:r>
-      <w:r>
-        <w:rPr>
-          <w:rFonts w:ascii="Times New Roman" w:cs="Times New Roman" w:eastAsia="Times New Roman" w:hAnsi="Times New Roman"/>
-          <w:sz w:val="22"/>
-          <w:szCs w:val="22"/>
-        </w:rPr>
-        <w:t xml:space="preserve">logical model</w:t>
-      </w:r>
-      <w:r>
-        <w:rPr>
-          <w:rFonts w:ascii="Times New Roman" w:cs="Times New Roman" w:eastAsia="Times New Roman" w:hAnsi="Times New Roman"/>
-          <w:sz w:val="22"/>
-          <w:szCs w:val="22"/>
-        </w:rPr>
-        <w:t xml:space="preserve">: the same design after mapping, showing the eight tables with their keys and the crow's-foot notation of each foreign-key link.</w:t>
+        <w:t xml:space="preserve">The design is presented at two levels. Figure 3.1 is the conceptual ER diagram: five entities and five relationships, with cardinality and participation. Figure 3.2 is the logical model: the same design after mapping, showing the eight tables with their keys and the crow's-foot notation of each foreign-key link.</w:t>
       </w:r>
     </w:p>
     <w:p>
@@ -3982,23 +3886,7 @@
           <w:sz w:val="22"/>
           <w:szCs w:val="22"/>
         </w:rPr>
-        <w:t xml:space="preserve">The conceptual model maps to </w:t>
-      </w:r>
-      <w:r>
-        <w:rPr>
-          <w:rFonts w:ascii="Times New Roman" w:cs="Times New Roman" w:eastAsia="Times New Roman" w:hAnsi="Times New Roman"/>
-          <w:sz w:val="22"/>
-          <w:szCs w:val="22"/>
-        </w:rPr>
-        <w:t xml:space="preserve">eight relations</w:t>
-      </w:r>
-      <w:r>
-        <w:rPr>
-          <w:rFonts w:ascii="Times New Roman" w:cs="Times New Roman" w:eastAsia="Times New Roman" w:hAnsi="Times New Roman"/>
-          <w:sz w:val="22"/>
-          <w:szCs w:val="22"/>
-        </w:rPr>
-        <w:t xml:space="preserve"> by three rules. (1) Each entity becomes a table whose primary key is its identifier. (2) For each 1:N relationship, the key of the "one" side is added to the "many" side as a foreign key declared </w:t>
+        <w:t xml:space="preserve">The conceptual model maps to eight relations by three rules. (1) Each entity becomes a table whose primary key is its identifier. (2) For each 1:N relationship, the key of the "one" side is added to the "many" side as a foreign key declared </w:t>
       </w:r>
       <w:r>
         <w:rPr>
@@ -11246,23 +11134,7 @@
           <w:sz w:val="21"/>
           <w:szCs w:val="21"/>
         </w:rPr>
-        <w:t xml:space="preserve"> does </w:t>
-      </w:r>
-      <w:r>
-        <w:rPr>
-          <w:rFonts w:ascii="Times New Roman" w:cs="Times New Roman" w:eastAsia="Times New Roman" w:hAnsi="Times New Roman"/>
-          <w:sz w:val="21"/>
-          <w:szCs w:val="21"/>
-        </w:rPr>
-        <w:t xml:space="preserve">not</w:t>
-      </w:r>
-      <w:r>
-        <w:rPr>
-          <w:rFonts w:ascii="Times New Roman" w:cs="Times New Roman" w:eastAsia="Times New Roman" w:hAnsi="Times New Roman"/>
-          <w:sz w:val="21"/>
-          <w:szCs w:val="21"/>
-        </w:rPr>
-        <w:t xml:space="preserve"> hold (A1), and </w:t>
+        <w:t xml:space="preserve"> does not hold (A1), and </w:t>
       </w:r>
       <w:r>
         <w:rPr>
@@ -14043,7 +13915,15 @@
           <w:sz w:val="22"/>
           <w:szCs w:val="22"/>
         </w:rPr>
-        <w:t xml:space="preserve">Why PAPER_AUTHOR needs the closer look.</w:t>
+        <w:t xml:space="preserve">Why PAPER_AUTHOR needs the closer look. It is the one relation with two overlapping candidate keys. That is the situation in which a relation can satisfy 3NF and still fail BCNF, because 3NF allows a dependency whose right-hand side is prime. Here it does not fail: the second dependency, </w:t>
+      </w:r>
+      <w:r>
+        <w:rPr>
+          <w:rFonts w:ascii="Courier New" w:cs="Courier New" w:eastAsia="Courier New" w:hAnsi="Courier New"/>
+          <w:sz w:val="20"/>
+          <w:szCs w:val="20"/>
+        </w:rPr>
+        <w:t xml:space="preserve">{paper_id, author_order} → author_id</w:t>
       </w:r>
       <w:r>
         <w:rPr>
@@ -14051,62 +13931,22 @@
           <w:sz w:val="22"/>
           <w:szCs w:val="22"/>
         </w:rPr>
-        <w:t xml:space="preserve"> It is the one relation with two overlapping candidate keys. That is the situation in which a relation can satisfy 3NF and still fail BCNF, because 3NF allows a dependency whose right-hand side is prime. Here it does not fail: the second dependency, </w:t>
-      </w:r>
-      <w:r>
-        <w:rPr>
-          <w:rFonts w:ascii="Courier New" w:cs="Courier New" w:eastAsia="Courier New" w:hAnsi="Courier New"/>
-          <w:sz w:val="20"/>
-          <w:szCs w:val="20"/>
-        </w:rPr>
-        <w:t xml:space="preserve">{paper_id, author_order} → author_id</w:t>
-      </w:r>
+        <w:t xml:space="preserve">, has a candidate key on its left-hand side. Without the second key the schema would still be in BCNF; with it, the schema is in BCNF and the position rule (A6) is guaranteed by the database.</w:t>
+      </w:r>
+    </w:p>
+    <w:p>
+      <w:pPr>
+        <w:keepNext w:val="false"/>
+        <w:spacing w:after="120" w:line="276"/>
+        <w:jc w:val="both"/>
+      </w:pPr>
       <w:r>
         <w:rPr>
           <w:rFonts w:ascii="Times New Roman" w:cs="Times New Roman" w:eastAsia="Times New Roman" w:hAnsi="Times New Roman"/>
           <w:sz w:val="22"/>
           <w:szCs w:val="22"/>
         </w:rPr>
-        <w:t xml:space="preserve">, has a candidate key on its left-hand side. Without the second key the schema would still be in BCNF; with it, the schema is in BCNF </w:t>
-      </w:r>
-      <w:r>
-        <w:rPr>
-          <w:rFonts w:ascii="Times New Roman" w:cs="Times New Roman" w:eastAsia="Times New Roman" w:hAnsi="Times New Roman"/>
-          <w:sz w:val="22"/>
-          <w:szCs w:val="22"/>
-        </w:rPr>
-        <w:t xml:space="preserve">and</w:t>
-      </w:r>
-      <w:r>
-        <w:rPr>
-          <w:rFonts w:ascii="Times New Roman" w:cs="Times New Roman" w:eastAsia="Times New Roman" w:hAnsi="Times New Roman"/>
-          <w:sz w:val="22"/>
-          <w:szCs w:val="22"/>
-        </w:rPr>
-        <w:t xml:space="preserve"> the position rule (A6) is guaranteed by the database.</w:t>
-      </w:r>
-    </w:p>
-    <w:p>
-      <w:pPr>
-        <w:keepNext w:val="false"/>
-        <w:spacing w:after="120" w:line="276"/>
-        <w:jc w:val="both"/>
-      </w:pPr>
-      <w:r>
-        <w:rPr>
-          <w:rFonts w:ascii="Times New Roman" w:cs="Times New Roman" w:eastAsia="Times New Roman" w:hAnsi="Times New Roman"/>
-          <w:sz w:val="22"/>
-          <w:szCs w:val="22"/>
-        </w:rPr>
-        <w:t xml:space="preserve">Conclusion.</w:t>
-      </w:r>
-      <w:r>
-        <w:rPr>
-          <w:rFonts w:ascii="Times New Roman" w:cs="Times New Roman" w:eastAsia="Times New Roman" w:hAnsi="Times New Roman"/>
-          <w:sz w:val="22"/>
-          <w:szCs w:val="22"/>
-        </w:rPr>
-        <w:t xml:space="preserve"> All eight relations are in BCNF with respect to the dependencies of 3.4.2. Adding or removing the alternate candidate keys does not change this, since any additional determinant is itself a key.</w:t>
+        <w:t xml:space="preserve">Conclusion. All eight relations are in BCNF with respect to the dependencies of 3.4.2. Adding or removing the alternate candidate keys does not change this, since any additional determinant is itself a key.</w:t>
       </w:r>
     </w:p>
     <w:p>
@@ -14722,7 +14562,15 @@
           <w:sz w:val="22"/>
           <w:szCs w:val="22"/>
         </w:rPr>
-        <w:t xml:space="preserve">Lossless join.</w:t>
+        <w:t xml:space="preserve">Lossless join. Every step above has the form: for a relation R(A, B, C) with the dependency A → B, replace R by (A, B) and (A, C). The common attribute A is a key of the first relation, so by Heath's theorem the natural join of the two parts returns exactly R, with no spurious tuples. In the final schema the joins run along the foreign keys (for example journal_id and publisher_id), and query Q1 and Q2 of </w:t>
+      </w:r>
+      <w:r>
+        <w:rPr>
+          <w:rFonts w:ascii="Courier New" w:cs="Courier New" w:eastAsia="Courier New" w:hAnsi="Courier New"/>
+          <w:sz w:val="20"/>
+          <w:szCs w:val="20"/>
+        </w:rPr>
+        <w:t xml:space="preserve">03_queries.sql</w:t>
       </w:r>
       <w:r>
         <w:rPr>
@@ -14730,46 +14578,22 @@
           <w:sz w:val="22"/>
           <w:szCs w:val="22"/>
         </w:rPr>
-        <w:t xml:space="preserve"> Every step above has the form: for a relation R(A, B, C) with the dependency A → B, replace R by (A, B) and (A, C). The common attribute A is a key of the first relation, so by Heath's theorem the natural join of the two parts returns exactly R, with no spurious tuples. In the final schema the joins run along the foreign keys (for example journal_id and publisher_id), and query Q1 and Q2 of </w:t>
-      </w:r>
-      <w:r>
-        <w:rPr>
-          <w:rFonts w:ascii="Courier New" w:cs="Courier New" w:eastAsia="Courier New" w:hAnsi="Courier New"/>
-          <w:sz w:val="20"/>
-          <w:szCs w:val="20"/>
-        </w:rPr>
-        <w:t xml:space="preserve">03_queries.sql</w:t>
-      </w:r>
+        <w:t xml:space="preserve"> rebuild the paper–journal–publisher and paper–authors views of the original flat relation.</w:t>
+      </w:r>
+    </w:p>
+    <w:p>
+      <w:pPr>
+        <w:keepNext w:val="false"/>
+        <w:spacing w:after="120" w:line="276"/>
+        <w:jc w:val="both"/>
+      </w:pPr>
       <w:r>
         <w:rPr>
           <w:rFonts w:ascii="Times New Roman" w:cs="Times New Roman" w:eastAsia="Times New Roman" w:hAnsi="Times New Roman"/>
           <w:sz w:val="22"/>
           <w:szCs w:val="22"/>
         </w:rPr>
-        <w:t xml:space="preserve"> rebuild the paper–journal–publisher and paper–authors views of the original flat relation.</w:t>
-      </w:r>
-    </w:p>
-    <w:p>
-      <w:pPr>
-        <w:keepNext w:val="false"/>
-        <w:spacing w:after="120" w:line="276"/>
-        <w:jc w:val="both"/>
-      </w:pPr>
-      <w:r>
-        <w:rPr>
-          <w:rFonts w:ascii="Times New Roman" w:cs="Times New Roman" w:eastAsia="Times New Roman" w:hAnsi="Times New Roman"/>
-          <w:sz w:val="22"/>
-          <w:szCs w:val="22"/>
-        </w:rPr>
-        <w:t xml:space="preserve">Dependency preservation.</w:t>
-      </w:r>
-      <w:r>
-        <w:rPr>
-          <w:rFonts w:ascii="Times New Roman" w:cs="Times New Roman" w:eastAsia="Times New Roman" w:hAnsi="Times New Roman"/>
-          <w:sz w:val="22"/>
-          <w:szCs w:val="22"/>
-        </w:rPr>
-        <w:t xml:space="preserve"> Every dependency of 3.4.2 has all of its attributes inside a single final relation, so each one is enforced by a key or </w:t>
+        <w:t xml:space="preserve">Dependency preservation. Every dependency of 3.4.2 has all of its attributes inside a single final relation, so each one is enforced by a key or </w:t>
       </w:r>
       <w:r>
         <w:rPr>
@@ -14924,7 +14748,7 @@
           <w:sz w:val="22"/>
           <w:szCs w:val="22"/>
         </w:rPr>
-        <w:t xml:space="preserve">The schema is implemented in PostgreSQL by five SQL scripts, run in the order shown.</w:t>
+        <w:t xml:space="preserve">The schema is implemented in PostgreSQL by six SQL scripts, run in the order shown.</w:t>
       </w:r>
     </w:p>
     <w:tbl>
@@ -15083,7 +14907,7 @@
                 <w:sz w:val="19"/>
                 <w:szCs w:val="19"/>
               </w:rPr>
-              <w:t xml:space="preserve">Creates the eight tables with all constraints of 3.3, the three business-rule triggers (BR3, BR5), the foreign-key indexes and the </w:t>
+              <w:t xml:space="preserve">Creates the eight tables with all constraints of 3.3, the four business-rule triggers (BR3, BR5), the foreign-key indexes and the </w:t>
             </w:r>
             <w:r>
               <w:rPr>
@@ -15428,6 +15252,91 @@
           </w:p>
         </w:tc>
       </w:tr>
+      <w:tr>
+        <w:trPr>
+          <w:cantSplit/>
+        </w:trPr>
+        <w:tc>
+          <w:tcPr>
+            <w:tcW w:type="dxa" w:w="2600"/>
+            <w:tcBorders>
+              <w:top w:val="single" w:color="808080" w:sz="4"/>
+              <w:left w:val="single" w:color="808080" w:sz="4"/>
+              <w:bottom w:val="single" w:color="808080" w:sz="4"/>
+              <w:right w:val="single" w:color="808080" w:sz="4"/>
+            </w:tcBorders>
+            <w:tcMar>
+              <w:top w:type="dxa" w:w="50"/>
+              <w:left w:type="dxa" w:w="90"/>
+              <w:bottom w:type="dxa" w:w="50"/>
+              <w:right w:type="dxa" w:w="90"/>
+            </w:tcMar>
+            <w:vAlign w:val="top"/>
+          </w:tcPr>
+          <w:p>
+            <w:pPr>
+              <w:spacing w:after="20"/>
+              <w:jc w:val="left"/>
+            </w:pPr>
+            <w:r>
+              <w:rPr>
+                <w:rFonts w:ascii="Courier New" w:cs="Courier New" w:eastAsia="Courier New" w:hAnsi="Courier New"/>
+                <w:sz w:val="17"/>
+                <w:szCs w:val="17"/>
+              </w:rPr>
+              <w:t xml:space="preserve">06_export_ui_data.sql</w:t>
+            </w:r>
+          </w:p>
+        </w:tc>
+        <w:tc>
+          <w:tcPr>
+            <w:tcW w:type="dxa" w:w="7146"/>
+            <w:tcBorders>
+              <w:top w:val="single" w:color="808080" w:sz="4"/>
+              <w:left w:val="single" w:color="808080" w:sz="4"/>
+              <w:bottom w:val="single" w:color="808080" w:sz="4"/>
+              <w:right w:val="single" w:color="808080" w:sz="4"/>
+            </w:tcBorders>
+            <w:tcMar>
+              <w:top w:type="dxa" w:w="50"/>
+              <w:left w:type="dxa" w:w="90"/>
+              <w:bottom w:type="dxa" w:w="50"/>
+              <w:right w:type="dxa" w:w="90"/>
+            </w:tcMar>
+            <w:vAlign w:val="top"/>
+          </w:tcPr>
+          <w:p>
+            <w:pPr>
+              <w:spacing w:after="20"/>
+              <w:jc w:val="left"/>
+            </w:pPr>
+            <w:r>
+              <w:rPr>
+                <w:rFonts w:ascii="Times New Roman" w:cs="Times New Roman" w:eastAsia="Times New Roman" w:hAnsi="Times New Roman"/>
+                <w:sz w:val="19"/>
+                <w:szCs w:val="19"/>
+              </w:rPr>
+              <w:t xml:space="preserve">Exports the table rows as JSON for the web interface (used by scripts/export-ui-data.sh).</w:t>
+            </w:r>
+            <w:r>
+              <w:rPr>
+                <w:rFonts w:ascii="Courier New" w:cs="Courier New" w:eastAsia="Courier New" w:hAnsi="Courier New"/>
+                <w:sz w:val="17"/>
+                <w:szCs w:val="17"/>
+              </w:rPr>
+              <w:t xml:space="preserve"/>
+            </w:r>
+            <w:r>
+              <w:rPr>
+                <w:rFonts w:ascii="Times New Roman" w:cs="Times New Roman" w:eastAsia="Times New Roman" w:hAnsi="Times New Roman"/>
+                <w:sz w:val="19"/>
+                <w:szCs w:val="19"/>
+              </w:rPr>
+              <w:t xml:space="preserve"/>
+            </w:r>
+          </w:p>
+        </w:tc>
+      </w:tr>
     </w:tbl>
     <w:p>
       <w:pPr>
@@ -15447,6 +15356,791 @@
           <w:szCs w:val="22"/>
         </w:rPr>
         <w:t xml:space="preserve">The web interface described in the UI Design Document is a separate static front end. It does not connect to the database at run time; its sample data follows the structure of this schema.</w:t>
+      </w:r>
+    </w:p>
+    <w:p>
+      <w:pPr>
+        <w:pStyle w:val="Heading1"/>
+        <w:keepNext/>
+        <w:spacing w:after="140" w:before="280"/>
+      </w:pPr>
+      <w:r>
+        <w:rPr>
+          <w:rFonts w:ascii="Times New Roman" w:cs="Times New Roman" w:eastAsia="Times New Roman" w:hAnsi="Times New Roman"/>
+          <w:b/>
+          <w:bCs/>
+          <w:sz w:val="30"/>
+          <w:szCs w:val="30"/>
+        </w:rPr>
+        <w:t xml:space="preserve">3.6 Test results on PostgreSQL 18.6</w:t>
+      </w:r>
+    </w:p>
+    <w:p>
+      <w:pPr>
+        <w:spacing w:after="120" w:line="276"/>
+        <w:jc w:val="both"/>
+      </w:pPr>
+      <w:r>
+        <w:rPr>
+          <w:rFonts w:ascii="Times New Roman" w:cs="Times New Roman" w:eastAsia="Times New Roman" w:hAnsi="Times New Roman"/>
+          <w:sz w:val="22"/>
+          <w:szCs w:val="22"/>
+        </w:rPr>
+        <w:t xml:space="preserve">The scripts of section 3.5 were run on PostgreSQL 18.6 on a team member's computer (Windows, psql). The figures below are screenshots of that run. The tests and the index demo leave the sample data unchanged: afterwards the tables still held 24 papers, 50 authorships and 45 citations.</w:t>
+      </w:r>
+    </w:p>
+    <w:p>
+      <w:pPr>
+        <w:keepNext/>
+        <w:spacing w:after="120" w:line="276"/>
+        <w:jc w:val="both"/>
+      </w:pPr>
+      <w:r>
+        <w:rPr>
+          <w:rFonts w:ascii="Times New Roman" w:cs="Times New Roman" w:eastAsia="Times New Roman" w:hAnsi="Times New Roman"/>
+          <w:sz w:val="22"/>
+          <w:szCs w:val="22"/>
+        </w:rPr>
+        <w:t xml:space="preserve">The schema script creates the eight tables. Figure 3.3 lists them with psql.</w:t>
+      </w:r>
+    </w:p>
+    <w:p>
+      <w:pPr>
+        <w:keepNext/>
+        <w:spacing w:after="60" w:before="100"/>
+        <w:jc w:val="center"/>
+      </w:pPr>
+      <w:r>
+        <w:drawing>
+          <wp:inline distT="0" distB="0" distL="0" distR="0">
+            <wp:extent cx="3840480" cy="1152144"/>
+            <wp:docPr id="501" name="Picture 501" descr="psql \dt output listing the eight tables"/>
+            <wp:cNvGraphicFramePr>
+              <a:graphicFrameLocks xmlns:a="http://schemas.openxmlformats.org/drawingml/2006/main" noChangeAspect="1"/>
+            </wp:cNvGraphicFramePr>
+            <a:graphic xmlns:a="http://schemas.openxmlformats.org/drawingml/2006/main">
+              <a:graphicData uri="http://schemas.openxmlformats.org/drawingml/2006/picture">
+                <pic:pic xmlns:pic="http://schemas.openxmlformats.org/drawingml/2006/picture">
+                  <pic:nvPicPr>
+                    <pic:cNvPr id="501" name="Picture 501"/>
+                    <pic:cNvPicPr/>
+                  </pic:nvPicPr>
+                  <pic:blipFill>
+                    <a:blip r:embed="rIdDb01"/>
+                    <a:stretch>
+                      <a:fillRect/>
+                    </a:stretch>
+                  </pic:blipFill>
+                  <pic:spPr>
+                    <a:xfrm>
+                      <a:off x="0" y="0"/>
+                      <a:ext cx="3840480" cy="1152144"/>
+                    </a:xfrm>
+                    <a:prstGeom prst="rect">
+                      <a:avLst/>
+                    </a:prstGeom>
+                  </pic:spPr>
+                </pic:pic>
+              </a:graphicData>
+            </a:graphic>
+          </wp:inline>
+        </w:drawing>
+      </w:r>
+    </w:p>
+    <w:p>
+      <w:pPr>
+        <w:spacing w:after="160"/>
+        <w:jc w:val="center"/>
+      </w:pPr>
+      <w:r>
+        <w:rPr>
+          <w:rFonts w:ascii="Times New Roman" w:cs="Times New Roman" w:eastAsia="Times New Roman" w:hAnsi="Times New Roman"/>
+          <w:i/>
+          <w:iCs/>
+          <w:sz w:val="20"/>
+          <w:szCs w:val="20"/>
+        </w:rPr>
+        <w:t xml:space="preserve">Figure 3.3  The eight tables created by 01_schema.sql (psql \dt)</w:t>
+      </w:r>
+    </w:p>
+    <w:p>
+      <w:pPr>
+        <w:keepNext/>
+        <w:spacing w:after="120" w:line="276"/>
+        <w:jc w:val="both"/>
+      </w:pPr>
+      <w:r>
+        <w:rPr>
+          <w:rFonts w:ascii="Times New Roman" w:cs="Times New Roman" w:eastAsia="Times New Roman" w:hAnsi="Times New Roman"/>
+          <w:sz w:val="22"/>
+          <w:szCs w:val="22"/>
+        </w:rPr>
+        <w:t xml:space="preserve">After 02_seed.sql, each table holds the number of rows stated in section 3.5.</w:t>
+      </w:r>
+    </w:p>
+    <w:p>
+      <w:pPr>
+        <w:keepNext/>
+        <w:spacing w:after="60" w:before="100"/>
+        <w:jc w:val="center"/>
+      </w:pPr>
+      <w:r>
+        <w:drawing>
+          <wp:inline distT="0" distB="0" distL="0" distR="0">
+            <wp:extent cx="3840480" cy="1086855"/>
+            <wp:docPr id="502" name="Picture 502" descr="Row counts after loading the sample data"/>
+            <wp:cNvGraphicFramePr>
+              <a:graphicFrameLocks xmlns:a="http://schemas.openxmlformats.org/drawingml/2006/main" noChangeAspect="1"/>
+            </wp:cNvGraphicFramePr>
+            <a:graphic xmlns:a="http://schemas.openxmlformats.org/drawingml/2006/main">
+              <a:graphicData uri="http://schemas.openxmlformats.org/drawingml/2006/picture">
+                <pic:pic xmlns:pic="http://schemas.openxmlformats.org/drawingml/2006/picture">
+                  <pic:nvPicPr>
+                    <pic:cNvPr id="502" name="Picture 502"/>
+                    <pic:cNvPicPr/>
+                  </pic:nvPicPr>
+                  <pic:blipFill>
+                    <a:blip r:embed="rIdDb02"/>
+                    <a:stretch>
+                      <a:fillRect/>
+                    </a:stretch>
+                  </pic:blipFill>
+                  <pic:spPr>
+                    <a:xfrm>
+                      <a:off x="0" y="0"/>
+                      <a:ext cx="3840480" cy="1086855"/>
+                    </a:xfrm>
+                    <a:prstGeom prst="rect">
+                      <a:avLst/>
+                    </a:prstGeom>
+                  </pic:spPr>
+                </pic:pic>
+              </a:graphicData>
+            </a:graphic>
+          </wp:inline>
+        </w:drawing>
+      </w:r>
+    </w:p>
+    <w:p>
+      <w:pPr>
+        <w:spacing w:after="160"/>
+        <w:jc w:val="center"/>
+      </w:pPr>
+      <w:r>
+        <w:rPr>
+          <w:rFonts w:ascii="Times New Roman" w:cs="Times New Roman" w:eastAsia="Times New Roman" w:hAnsi="Times New Roman"/>
+          <w:i/>
+          <w:iCs/>
+          <w:sz w:val="20"/>
+          <w:szCs w:val="20"/>
+        </w:rPr>
+        <w:t xml:space="preserve">Figure 3.4  Row counts after 02_seed.sql: 6 publishers, 8 journals, 11 authors, 9 subjects, 24 papers, 50 authorships, 43 classifications, 45 citations</w:t>
+      </w:r>
+    </w:p>
+    <w:p>
+      <w:pPr>
+        <w:keepNext/>
+        <w:spacing w:after="120" w:line="276"/>
+        <w:jc w:val="both"/>
+      </w:pPr>
+      <w:r>
+        <w:rPr>
+          <w:rFonts w:ascii="Times New Roman" w:cs="Times New Roman" w:eastAsia="Times New Roman" w:hAnsi="Times New Roman"/>
+          <w:sz w:val="22"/>
+          <w:szCs w:val="22"/>
+        </w:rPr>
+        <w:t xml:space="preserve">Figure 3.5 shows how the bridge table paper_author is defined in the database: the composite primary key, the second candidate key (paper_id, author_order), the check constraint, the two foreign keys with their delete actions, and the deferred trigger that keeps at least one author on every paper.</w:t>
+      </w:r>
+    </w:p>
+    <w:p>
+      <w:pPr>
+        <w:keepNext/>
+        <w:spacing w:after="60" w:before="100"/>
+        <w:jc w:val="center"/>
+      </w:pPr>
+      <w:r>
+        <w:drawing>
+          <wp:inline distT="0" distB="0" distL="0" distR="0">
+            <wp:extent cx="5760720" cy="1382332"/>
+            <wp:docPr id="503" name="Picture 503" descr="psql \d paper_author output"/>
+            <wp:cNvGraphicFramePr>
+              <a:graphicFrameLocks xmlns:a="http://schemas.openxmlformats.org/drawingml/2006/main" noChangeAspect="1"/>
+            </wp:cNvGraphicFramePr>
+            <a:graphic xmlns:a="http://schemas.openxmlformats.org/drawingml/2006/main">
+              <a:graphicData uri="http://schemas.openxmlformats.org/drawingml/2006/picture">
+                <pic:pic xmlns:pic="http://schemas.openxmlformats.org/drawingml/2006/picture">
+                  <pic:nvPicPr>
+                    <pic:cNvPr id="503" name="Picture 503"/>
+                    <pic:cNvPicPr/>
+                  </pic:nvPicPr>
+                  <pic:blipFill>
+                    <a:blip r:embed="rIdDb03"/>
+                    <a:stretch>
+                      <a:fillRect/>
+                    </a:stretch>
+                  </pic:blipFill>
+                  <pic:spPr>
+                    <a:xfrm>
+                      <a:off x="0" y="0"/>
+                      <a:ext cx="5760720" cy="1382332"/>
+                    </a:xfrm>
+                    <a:prstGeom prst="rect">
+                      <a:avLst/>
+                    </a:prstGeom>
+                  </pic:spPr>
+                </pic:pic>
+              </a:graphicData>
+            </a:graphic>
+          </wp:inline>
+        </w:drawing>
+      </w:r>
+    </w:p>
+    <w:p>
+      <w:pPr>
+        <w:spacing w:after="160"/>
+        <w:jc w:val="center"/>
+      </w:pPr>
+      <w:r>
+        <w:rPr>
+          <w:rFonts w:ascii="Times New Roman" w:cs="Times New Roman" w:eastAsia="Times New Roman" w:hAnsi="Times New Roman"/>
+          <w:i/>
+          <w:iCs/>
+          <w:sz w:val="20"/>
+          <w:szCs w:val="20"/>
+        </w:rPr>
+        <w:t xml:space="preserve">Figure 3.5  Structure of paper_author (psql \d paper_author)</w:t>
+      </w:r>
+    </w:p>
+    <w:p>
+      <w:pPr>
+        <w:keepNext/>
+        <w:spacing w:after="120" w:line="276"/>
+        <w:jc w:val="both"/>
+      </w:pPr>
+      <w:r>
+        <w:rPr>
+          <w:rFonts w:ascii="Times New Roman" w:cs="Times New Roman" w:eastAsia="Times New Roman" w:hAnsi="Times New Roman"/>
+          <w:sz w:val="22"/>
+          <w:szCs w:val="22"/>
+        </w:rPr>
+        <w:t xml:space="preserve">The 39 constraint tests try to break each rule. Figure 3.6 shows the result: 39 passed, 0 failed. The screenshot shows tests 5 to 27 and the summary row, which counts all 39 tests. In this run PostgreSQL reported the three ON DELETE RESTRICT deletes (tests 8, 15 and 26) with SQLSTATE 23001 (restrict_violation), and the tests expect that code.</w:t>
+      </w:r>
+    </w:p>
+    <w:p>
+      <w:pPr>
+        <w:keepNext/>
+        <w:spacing w:after="60" w:before="100"/>
+        <w:jc w:val="center"/>
+      </w:pPr>
+      <w:r>
+        <w:drawing>
+          <wp:inline distT="0" distB="0" distL="0" distR="0">
+            <wp:extent cx="5691591" cy="2496311"/>
+            <wp:docPr id="504" name="Picture 504" descr="Result of the constraint test script"/>
+            <wp:cNvGraphicFramePr>
+              <a:graphicFrameLocks xmlns:a="http://schemas.openxmlformats.org/drawingml/2006/main" noChangeAspect="1"/>
+            </wp:cNvGraphicFramePr>
+            <a:graphic xmlns:a="http://schemas.openxmlformats.org/drawingml/2006/main">
+              <a:graphicData uri="http://schemas.openxmlformats.org/drawingml/2006/picture">
+                <pic:pic xmlns:pic="http://schemas.openxmlformats.org/drawingml/2006/picture">
+                  <pic:nvPicPr>
+                    <pic:cNvPr id="504" name="Picture 504"/>
+                    <pic:cNvPicPr/>
+                  </pic:nvPicPr>
+                  <pic:blipFill>
+                    <a:blip r:embed="rIdDb04"/>
+                    <a:stretch>
+                      <a:fillRect/>
+                    </a:stretch>
+                  </pic:blipFill>
+                  <pic:spPr>
+                    <a:xfrm>
+                      <a:off x="0" y="0"/>
+                      <a:ext cx="5691591" cy="2496311"/>
+                    </a:xfrm>
+                    <a:prstGeom prst="rect">
+                      <a:avLst/>
+                    </a:prstGeom>
+                  </pic:spPr>
+                </pic:pic>
+              </a:graphicData>
+            </a:graphic>
+          </wp:inline>
+        </w:drawing>
+      </w:r>
+    </w:p>
+    <w:p>
+      <w:pPr>
+        <w:spacing w:after="160"/>
+        <w:jc w:val="center"/>
+      </w:pPr>
+      <w:r>
+        <w:rPr>
+          <w:rFonts w:ascii="Times New Roman" w:cs="Times New Roman" w:eastAsia="Times New Roman" w:hAnsi="Times New Roman"/>
+          <w:i/>
+          <w:iCs/>
+          <w:sz w:val="20"/>
+          <w:szCs w:val="20"/>
+        </w:rPr>
+        <w:t xml:space="preserve">Figure 3.6  Result of 04_constraint_tests.sql: 39 passed, 0 failed, 39 total</w:t>
+      </w:r>
+    </w:p>
+    <w:p>
+      <w:pPr>
+        <w:keepNext/>
+        <w:spacing w:after="120" w:line="276"/>
+        <w:jc w:val="both"/>
+      </w:pPr>
+      <w:r>
+        <w:rPr>
+          <w:rFonts w:ascii="Times New Roman" w:cs="Times New Roman" w:eastAsia="Times New Roman" w:hAnsi="Times New Roman"/>
+          <w:sz w:val="22"/>
+          <w:szCs w:val="22"/>
+        </w:rPr>
+        <w:t xml:space="preserve">Figure 3.7 shows the rule that a paper may only cite a strictly earlier paper. Paper 19 (2018) cannot cite paper 1 (2024); the insert is rejected by the trigger and the citation table keeps its 45 rows.</w:t>
+      </w:r>
+    </w:p>
+    <w:p>
+      <w:pPr>
+        <w:keepNext/>
+        <w:spacing w:after="60" w:before="100"/>
+        <w:jc w:val="center"/>
+      </w:pPr>
+      <w:r>
+        <w:drawing>
+          <wp:inline distT="0" distB="0" distL="0" distR="0">
+            <wp:extent cx="5760720" cy="601014"/>
+            <wp:docPr id="505" name="Picture 505" descr="A citation from an older paper to a newer paper is rejected"/>
+            <wp:cNvGraphicFramePr>
+              <a:graphicFrameLocks xmlns:a="http://schemas.openxmlformats.org/drawingml/2006/main" noChangeAspect="1"/>
+            </wp:cNvGraphicFramePr>
+            <a:graphic xmlns:a="http://schemas.openxmlformats.org/drawingml/2006/main">
+              <a:graphicData uri="http://schemas.openxmlformats.org/drawingml/2006/picture">
+                <pic:pic xmlns:pic="http://schemas.openxmlformats.org/drawingml/2006/picture">
+                  <pic:nvPicPr>
+                    <pic:cNvPr id="505" name="Picture 505"/>
+                    <pic:cNvPicPr/>
+                  </pic:nvPicPr>
+                  <pic:blipFill>
+                    <a:blip r:embed="rIdDb05"/>
+                    <a:stretch>
+                      <a:fillRect/>
+                    </a:stretch>
+                  </pic:blipFill>
+                  <pic:spPr>
+                    <a:xfrm>
+                      <a:off x="0" y="0"/>
+                      <a:ext cx="5760720" cy="601014"/>
+                    </a:xfrm>
+                    <a:prstGeom prst="rect">
+                      <a:avLst/>
+                    </a:prstGeom>
+                  </pic:spPr>
+                </pic:pic>
+              </a:graphicData>
+            </a:graphic>
+          </wp:inline>
+        </w:drawing>
+      </w:r>
+    </w:p>
+    <w:p>
+      <w:pPr>
+        <w:spacing w:after="160"/>
+        <w:jc w:val="center"/>
+      </w:pPr>
+      <w:r>
+        <w:rPr>
+          <w:rFonts w:ascii="Times New Roman" w:cs="Times New Roman" w:eastAsia="Times New Roman" w:hAnsi="Times New Roman"/>
+          <w:i/>
+          <w:iCs/>
+          <w:sz w:val="20"/>
+          <w:szCs w:val="20"/>
+        </w:rPr>
+        <w:t xml:space="preserve">Figure 3.7  Citation rule enforced by a trigger: INSERT INTO citation VALUES (19,1) is rejected</w:t>
+      </w:r>
+    </w:p>
+    <w:p>
+      <w:pPr>
+        <w:keepNext/>
+        <w:spacing w:after="120" w:line="276"/>
+        <w:jc w:val="both"/>
+      </w:pPr>
+      <w:r>
+        <w:rPr>
+          <w:rFonts w:ascii="Times New Roman" w:cs="Times New Roman" w:eastAsia="Times New Roman" w:hAnsi="Times New Roman"/>
+          <w:sz w:val="22"/>
+          <w:szCs w:val="22"/>
+        </w:rPr>
+        <w:t xml:space="preserve">Q9 ranks papers by the number of citations they receive, computed from the citation rows. RANK() gives tied papers the same rank and skips the following numbers, so four papers share rank 4 and the next rank is 8. The query shows the first ten rows; papers 12 and 16 also have 2 citations and rank 8 but fall outside LIMIT 10.</w:t>
+      </w:r>
+    </w:p>
+    <w:p>
+      <w:pPr>
+        <w:keepNext/>
+        <w:spacing w:after="60" w:before="100"/>
+        <w:jc w:val="center"/>
+      </w:pPr>
+      <w:r>
+        <w:drawing>
+          <wp:inline distT="0" distB="0" distL="0" distR="0">
+            <wp:extent cx="5760720" cy="1198070"/>
+            <wp:docPr id="506" name="Picture 506" descr="Q9 citation ranking with ties"/>
+            <wp:cNvGraphicFramePr>
+              <a:graphicFrameLocks xmlns:a="http://schemas.openxmlformats.org/drawingml/2006/main" noChangeAspect="1"/>
+            </wp:cNvGraphicFramePr>
+            <a:graphic xmlns:a="http://schemas.openxmlformats.org/drawingml/2006/main">
+              <a:graphicData uri="http://schemas.openxmlformats.org/drawingml/2006/picture">
+                <pic:pic xmlns:pic="http://schemas.openxmlformats.org/drawingml/2006/picture">
+                  <pic:nvPicPr>
+                    <pic:cNvPr id="506" name="Picture 506"/>
+                    <pic:cNvPicPr/>
+                  </pic:nvPicPr>
+                  <pic:blipFill>
+                    <a:blip r:embed="rIdDb06"/>
+                    <a:stretch>
+                      <a:fillRect/>
+                    </a:stretch>
+                  </pic:blipFill>
+                  <pic:spPr>
+                    <a:xfrm>
+                      <a:off x="0" y="0"/>
+                      <a:ext cx="5760720" cy="1198070"/>
+                    </a:xfrm>
+                    <a:prstGeom prst="rect">
+                      <a:avLst/>
+                    </a:prstGeom>
+                  </pic:spPr>
+                </pic:pic>
+              </a:graphicData>
+            </a:graphic>
+          </wp:inline>
+        </w:drawing>
+      </w:r>
+    </w:p>
+    <w:p>
+      <w:pPr>
+        <w:spacing w:after="160"/>
+        <w:jc w:val="center"/>
+      </w:pPr>
+      <w:r>
+        <w:rPr>
+          <w:rFonts w:ascii="Times New Roman" w:cs="Times New Roman" w:eastAsia="Times New Roman" w:hAnsi="Times New Roman"/>
+          <w:i/>
+          <w:iCs/>
+          <w:sz w:val="20"/>
+          <w:szCs w:val="20"/>
+        </w:rPr>
+        <w:t xml:space="preserve">Figure 3.8  Q9: citation ranking with RANK() (ties share a rank)</w:t>
+      </w:r>
+    </w:p>
+    <w:p>
+      <w:pPr>
+        <w:keepNext/>
+        <w:spacing w:after="120" w:line="276"/>
+        <w:jc w:val="both"/>
+      </w:pPr>
+      <w:r>
+        <w:rPr>
+          <w:rFonts w:ascii="Times New Roman" w:cs="Times New Roman" w:eastAsia="Times New Roman" w:hAnsi="Times New Roman"/>
+          <w:sz w:val="22"/>
+          <w:szCs w:val="22"/>
+        </w:rPr>
+        <w:t xml:space="preserve">Q16 is the recursive query. Starting from paper 1, it follows the citation rows step by step and reports every paper reached, with the shortest number of steps.</w:t>
+      </w:r>
+    </w:p>
+    <w:p>
+      <w:pPr>
+        <w:keepNext/>
+        <w:spacing w:after="60" w:before="100"/>
+        <w:jc w:val="center"/>
+      </w:pPr>
+      <w:r>
+        <w:drawing>
+          <wp:inline distT="0" distB="0" distL="0" distR="0">
+            <wp:extent cx="5760720" cy="995307"/>
+            <wp:docPr id="507" name="Picture 507" descr="Q16 recursive citation chain"/>
+            <wp:cNvGraphicFramePr>
+              <a:graphicFrameLocks xmlns:a="http://schemas.openxmlformats.org/drawingml/2006/main" noChangeAspect="1"/>
+            </wp:cNvGraphicFramePr>
+            <a:graphic xmlns:a="http://schemas.openxmlformats.org/drawingml/2006/main">
+              <a:graphicData uri="http://schemas.openxmlformats.org/drawingml/2006/picture">
+                <pic:pic xmlns:pic="http://schemas.openxmlformats.org/drawingml/2006/picture">
+                  <pic:nvPicPr>
+                    <pic:cNvPr id="507" name="Picture 507"/>
+                    <pic:cNvPicPr/>
+                  </pic:nvPicPr>
+                  <pic:blipFill>
+                    <a:blip r:embed="rIdDb07"/>
+                    <a:stretch>
+                      <a:fillRect/>
+                    </a:stretch>
+                  </pic:blipFill>
+                  <pic:spPr>
+                    <a:xfrm>
+                      <a:off x="0" y="0"/>
+                      <a:ext cx="5760720" cy="995307"/>
+                    </a:xfrm>
+                    <a:prstGeom prst="rect">
+                      <a:avLst/>
+                    </a:prstGeom>
+                  </pic:spPr>
+                </pic:pic>
+              </a:graphicData>
+            </a:graphic>
+          </wp:inline>
+        </w:drawing>
+      </w:r>
+    </w:p>
+    <w:p>
+      <w:pPr>
+        <w:spacing w:after="160"/>
+        <w:jc w:val="center"/>
+      </w:pPr>
+      <w:r>
+        <w:rPr>
+          <w:rFonts w:ascii="Times New Roman" w:cs="Times New Roman" w:eastAsia="Times New Roman" w:hAnsi="Times New Roman"/>
+          <w:i/>
+          <w:iCs/>
+          <w:sz w:val="20"/>
+          <w:szCs w:val="20"/>
+        </w:rPr>
+        <w:t xml:space="preserve">Figure 3.9  Q16: recursive query, all papers cited by paper 1, directly (depth 1) or indirectly (depth 2)</w:t>
+      </w:r>
+    </w:p>
+    <w:p>
+      <w:pPr>
+        <w:keepNext/>
+        <w:spacing w:after="120" w:line="276"/>
+        <w:jc w:val="both"/>
+      </w:pPr>
+      <w:r>
+        <w:rPr>
+          <w:rFonts w:ascii="Times New Roman" w:cs="Times New Roman" w:eastAsia="Times New Roman" w:hAnsi="Times New Roman"/>
+          <w:sz w:val="22"/>
+          <w:szCs w:val="22"/>
+        </w:rPr>
+        <w:t xml:space="preserve">Q18 uses the pg_trgm extension to tolerate typing mistakes. The % operator compares the whole strings.</w:t>
+      </w:r>
+    </w:p>
+    <w:p>
+      <w:pPr>
+        <w:keepNext/>
+        <w:spacing w:after="60" w:before="100"/>
+        <w:jc w:val="center"/>
+      </w:pPr>
+      <w:r>
+        <w:drawing>
+          <wp:inline distT="0" distB="0" distL="0" distR="0">
+            <wp:extent cx="5760720" cy="437332"/>
+            <wp:docPr id="508" name="Picture 508" descr="Q18 fuzzy search with the percent operator"/>
+            <wp:cNvGraphicFramePr>
+              <a:graphicFrameLocks xmlns:a="http://schemas.openxmlformats.org/drawingml/2006/main" noChangeAspect="1"/>
+            </wp:cNvGraphicFramePr>
+            <a:graphic xmlns:a="http://schemas.openxmlformats.org/drawingml/2006/main">
+              <a:graphicData uri="http://schemas.openxmlformats.org/drawingml/2006/picture">
+                <pic:pic xmlns:pic="http://schemas.openxmlformats.org/drawingml/2006/picture">
+                  <pic:nvPicPr>
+                    <pic:cNvPr id="508" name="Picture 508"/>
+                    <pic:cNvPicPr/>
+                  </pic:nvPicPr>
+                  <pic:blipFill>
+                    <a:blip r:embed="rIdDb08"/>
+                    <a:stretch>
+                      <a:fillRect/>
+                    </a:stretch>
+                  </pic:blipFill>
+                  <pic:spPr>
+                    <a:xfrm>
+                      <a:off x="0" y="0"/>
+                      <a:ext cx="5760720" cy="437332"/>
+                    </a:xfrm>
+                    <a:prstGeom prst="rect">
+                      <a:avLst/>
+                    </a:prstGeom>
+                  </pic:spPr>
+                </pic:pic>
+              </a:graphicData>
+            </a:graphic>
+          </wp:inline>
+        </w:drawing>
+      </w:r>
+    </w:p>
+    <w:p>
+      <w:pPr>
+        <w:spacing w:after="160"/>
+        <w:jc w:val="center"/>
+      </w:pPr>
+      <w:r>
+        <w:rPr>
+          <w:rFonts w:ascii="Times New Roman" w:cs="Times New Roman" w:eastAsia="Times New Roman" w:hAnsi="Times New Roman"/>
+          <w:i/>
+          <w:iCs/>
+          <w:sz w:val="20"/>
+          <w:szCs w:val="20"/>
+        </w:rPr>
+        <w:t xml:space="preserve">Figure 3.10  Q18: fuzzy title search with % (whole-string trigram similarity, threshold 0.3)</w:t>
+      </w:r>
+    </w:p>
+    <w:p>
+      <w:pPr>
+        <w:keepNext/>
+        <w:spacing w:after="120" w:line="276"/>
+        <w:jc w:val="both"/>
+      </w:pPr>
+      <w:r>
+        <w:rPr>
+          <w:rFonts w:ascii="Times New Roman" w:cs="Times New Roman" w:eastAsia="Times New Roman" w:hAnsi="Times New Roman"/>
+          <w:sz w:val="22"/>
+          <w:szCs w:val="22"/>
+        </w:rPr>
+        <w:t xml:space="preserve">The last script, 05_trigram_demo.sql, loads 200,000 generated papers and runs the same fuzzy search twice. Without the trigram index, PostgreSQL reads every row of the table.</w:t>
+      </w:r>
+    </w:p>
+    <w:p>
+      <w:pPr>
+        <w:keepNext/>
+        <w:spacing w:after="60" w:before="100"/>
+        <w:jc w:val="center"/>
+      </w:pPr>
+      <w:r>
+        <w:drawing>
+          <wp:inline distT="0" distB="0" distL="0" distR="0">
+            <wp:extent cx="5760720" cy="1343266"/>
+            <wp:docPr id="509" name="Picture 509" descr="EXPLAIN ANALYZE without the trigram index"/>
+            <wp:cNvGraphicFramePr>
+              <a:graphicFrameLocks xmlns:a="http://schemas.openxmlformats.org/drawingml/2006/main" noChangeAspect="1"/>
+            </wp:cNvGraphicFramePr>
+            <a:graphic xmlns:a="http://schemas.openxmlformats.org/drawingml/2006/main">
+              <a:graphicData uri="http://schemas.openxmlformats.org/drawingml/2006/picture">
+                <pic:pic xmlns:pic="http://schemas.openxmlformats.org/drawingml/2006/picture">
+                  <pic:nvPicPr>
+                    <pic:cNvPr id="509" name="Picture 509"/>
+                    <pic:cNvPicPr/>
+                  </pic:nvPicPr>
+                  <pic:blipFill>
+                    <a:blip r:embed="rIdDb10"/>
+                    <a:stretch>
+                      <a:fillRect/>
+                    </a:stretch>
+                  </pic:blipFill>
+                  <pic:spPr>
+                    <a:xfrm>
+                      <a:off x="0" y="0"/>
+                      <a:ext cx="5760720" cy="1343266"/>
+                    </a:xfrm>
+                    <a:prstGeom prst="rect">
+                      <a:avLst/>
+                    </a:prstGeom>
+                  </pic:spPr>
+                </pic:pic>
+              </a:graphicData>
+            </a:graphic>
+          </wp:inline>
+        </w:drawing>
+      </w:r>
+    </w:p>
+    <w:p>
+      <w:pPr>
+        <w:spacing w:after="160"/>
+        <w:jc w:val="center"/>
+      </w:pPr>
+      <w:r>
+        <w:rPr>
+          <w:rFonts w:ascii="Times New Roman" w:cs="Times New Roman" w:eastAsia="Times New Roman" w:hAnsi="Times New Roman"/>
+          <w:i/>
+          <w:iCs/>
+          <w:sz w:val="20"/>
+          <w:szCs w:val="20"/>
+        </w:rPr>
+        <w:t xml:space="preserve">Figure 3.11  EXPLAIN ANALYZE without the index: Parallel Seq Scan on paper, execution time 457.664 ms</w:t>
+      </w:r>
+    </w:p>
+    <w:p>
+      <w:pPr>
+        <w:keepNext/>
+        <w:spacing w:after="120" w:line="276"/>
+        <w:jc w:val="both"/>
+      </w:pPr>
+      <w:r>
+        <w:rPr>
+          <w:rFonts w:ascii="Times New Roman" w:cs="Times New Roman" w:eastAsia="Times New Roman" w:hAnsi="Times New Roman"/>
+          <w:sz w:val="22"/>
+          <w:szCs w:val="22"/>
+        </w:rPr>
+        <w:t xml:space="preserve">With the GIN trigram index on paper.title, the same search uses a bitmap index scan and reads only the matching rows.</w:t>
+      </w:r>
+    </w:p>
+    <w:p>
+      <w:pPr>
+        <w:keepNext/>
+        <w:spacing w:after="60" w:before="100"/>
+        <w:jc w:val="center"/>
+      </w:pPr>
+      <w:r>
+        <w:drawing>
+          <wp:inline distT="0" distB="0" distL="0" distR="0">
+            <wp:extent cx="5760720" cy="1303741"/>
+            <wp:docPr id="510" name="Picture 510" descr="EXPLAIN ANALYZE with the trigram index"/>
+            <wp:cNvGraphicFramePr>
+              <a:graphicFrameLocks xmlns:a="http://schemas.openxmlformats.org/drawingml/2006/main" noChangeAspect="1"/>
+            </wp:cNvGraphicFramePr>
+            <a:graphic xmlns:a="http://schemas.openxmlformats.org/drawingml/2006/main">
+              <a:graphicData uri="http://schemas.openxmlformats.org/drawingml/2006/picture">
+                <pic:pic xmlns:pic="http://schemas.openxmlformats.org/drawingml/2006/picture">
+                  <pic:nvPicPr>
+                    <pic:cNvPr id="510" name="Picture 510"/>
+                    <pic:cNvPicPr/>
+                  </pic:nvPicPr>
+                  <pic:blipFill>
+                    <a:blip r:embed="rIdDb11"/>
+                    <a:stretch>
+                      <a:fillRect/>
+                    </a:stretch>
+                  </pic:blipFill>
+                  <pic:spPr>
+                    <a:xfrm>
+                      <a:off x="0" y="0"/>
+                      <a:ext cx="5760720" cy="1303741"/>
+                    </a:xfrm>
+                    <a:prstGeom prst="rect">
+                      <a:avLst/>
+                    </a:prstGeom>
+                  </pic:spPr>
+                </pic:pic>
+              </a:graphicData>
+            </a:graphic>
+          </wp:inline>
+        </w:drawing>
+      </w:r>
+    </w:p>
+    <w:p>
+      <w:pPr>
+        <w:spacing w:after="160"/>
+        <w:jc w:val="center"/>
+      </w:pPr>
+      <w:r>
+        <w:rPr>
+          <w:rFonts w:ascii="Times New Roman" w:cs="Times New Roman" w:eastAsia="Times New Roman" w:hAnsi="Times New Roman"/>
+          <w:i/>
+          <w:iCs/>
+          <w:sz w:val="20"/>
+          <w:szCs w:val="20"/>
+        </w:rPr>
+        <w:t xml:space="preserve">Figure 3.12  EXPLAIN ANALYZE with the index: Bitmap Index Scan on idx_paper_title_trgm, execution time 1.128 ms</w:t>
+      </w:r>
+    </w:p>
+    <w:p>
+      <w:pPr>
+        <w:spacing w:after="120" w:line="276"/>
+        <w:jc w:val="both"/>
+      </w:pPr>
+      <w:r>
+        <w:rPr>
+          <w:rFonts w:ascii="Times New Roman" w:cs="Times New Roman" w:eastAsia="Times New Roman" w:hAnsi="Times New Roman"/>
+          <w:sz w:val="22"/>
+          <w:szCs w:val="22"/>
+        </w:rPr>
+        <w:t xml:space="preserve">The execution times depend on the computer; what matters is the change of plan from a sequential scan to an index scan. All figures come from the scripts in the db folder of the repository, which can be run again in the same order.</w:t>
       </w:r>
     </w:p>
     <w:sectPr>

</xml_diff>